<commit_message>
docs: polish proposal and update repository links
</commit_message>
<xml_diff>
--- a/docs/competition/MoonDepSolve项目申报书.docx
+++ b/docs/competition/MoonDepSolve项目申报书.docx
@@ -104,7 +104,7 @@
           </w:tcPr>
           <w:p>
             <w:r>
-              <w:t>https://gitlink.org.cn/python123/moonloglens</w:t>
+              <w:t>https://gitlink.org.cn/python123/moondepsolve</w:t>
             </w:r>
           </w:p>
         </w:tc>
@@ -126,7 +126,7 @@
           </w:tcPr>
           <w:p>
             <w:r>
-              <w:t>https://github.com/python123-ops/moonloglens</w:t>
+              <w:t>https://github.com/python123-ops/moondepsolve</w:t>
             </w:r>
           </w:p>
         </w:tc>
@@ -142,7 +142,7 @@
     </w:p>
     <w:p>
       <w:r>
-        <w:t>MoonDepSolve 是一个面向 MoonBit 包生态的基础软件组件，提供语义版本解析、版本约束匹配、依赖图求解、冲突诊断和锁文件格式化能力。项目采用纯 MoonBit 实现，不依赖外部服务，可作为包管理器、构建系统、依赖审计工具和自动化发布流程中的底层模块。</w:t>
+        <w:t>MoonDepSolve 面向 MoonBit 包生态中的版本约束和依赖选择问题，提供语义版本解析、版本范围匹配、依赖图求解、冲突诊断和依赖锁定结果输出。项目使用 MoonBit 编写，不依赖外部服务，适合在包管理、构建规划、依赖检查和自动化发布流程中作为基础组件使用。</w:t>
       </w:r>
     </w:p>
     <w:p>
@@ -155,7 +155,7 @@
     </w:p>
     <w:p>
       <w:r>
-        <w:t>依赖求解是包管理和构建系统中的成熟基础领域。随着 MoonBit 包生态增长，工具链需要能够判断版本兼容性、选择可用版本组合、解释依赖冲突，并形成稳定的解析结果。MoonDepSolve 可服务于依赖安装、构建规划、兼容性检查、依赖升级建议和教学示例等场景。</w:t>
+        <w:t>依赖求解是包管理和构建系统中的基础能力。随着 MoonBit 包数量增加，工具链需要能够判断版本兼容性、选择可用版本组合、解释依赖冲突，并形成稳定的解析结果。MoonDepSolve 可服务于依赖安装、构建规划、兼容性检查、依赖升级建议和教学示例等场景。</w:t>
       </w:r>
     </w:p>
     <w:p>
@@ -168,7 +168,7 @@
     </w:p>
     <w:p>
       <w:r>
-        <w:t>项目首版实现语义版本解析、prerelease 排序、exact/caret/tilde/comparator/wildcard 五类约束解析、版本匹配、传递依赖求解、最高兼容版本选择、冲突路径诊断和 lock-style 文本输出。命令行示例会展示一个内置包索引的求解过程，测试覆盖成功解析和失败诊断场景。</w:t>
+        <w:t>项目目前实现语义版本解析、prerelease 排序、exact/caret/tilde/comparator/wildcard 五类约束解析、版本匹配、传递依赖求解、最高兼容版本选择、冲突路径诊断和依赖锁定结果输出。命令行示例会展示一个内置包索引的求解过程，测试覆盖成功解析和失败诊断场景。</w:t>
       </w:r>
     </w:p>
     <w:p>
@@ -176,12 +176,12 @@
         <w:pStyle w:val="Heading1"/>
       </w:pPr>
       <w:r>
-        <w:t>四、原创性说明</w:t>
+        <w:t>四、实现说明</w:t>
       </w:r>
     </w:p>
     <w:p>
       <w:r>
-        <w:t>本项目为原创 MoonBit 实现，不是移植已有开源项目。项目围绕 MoonBit 包生态中常见的版本约束和依赖图问题重新设计数据结构、解析器、求解流程和错误诊断。首版刻意保持内核小而完整，不引入外部依赖，不绑定具体平台接口，保证可测试、可阅读、可扩展。</w:t>
+        <w:t>项目代码围绕 MoonBit 版本约束场景自行设计数据结构、解析器、求解流程和错误诊断。目前版本控制在较小规模内，不引入外部依赖，也不绑定具体平台接口，便于评审直接克隆、运行和检查。</w:t>
       </w:r>
     </w:p>
     <w:p>
@@ -194,7 +194,7 @@
     </w:p>
     <w:p>
       <w:r>
-        <w:t>项目采用“解析层、约束层、求解层、展示层”的结构。解析层负责版本和约束字符串；约束层将范围统一表示为 comparator 数组；求解层从根依赖开始遍历包索引，选择最高兼容版本并展开传递依赖；诊断层在包缺失、无匹配版本或已选版本冲突时输出可读错误；展示层通过 CLI 和 lock-style 文本展示结果。</w:t>
+        <w:t>项目采用“解析层、约束层、求解层、展示层”的结构。解析层负责版本和约束字符串；约束层将范围统一表示为 comparator 数组；求解层从根依赖开始遍历包索引，选择最高兼容版本并展开传递依赖；诊断层在包缺失、无匹配版本或已选版本冲突时输出可读错误；展示层通过 CLI 和依赖锁定结果文本展示结果。</w:t>
       </w:r>
     </w:p>
     <w:p>
@@ -207,7 +207,7 @@
     </w:p>
     <w:p>
       <w:r>
-        <w:t>项目预期交付一个可运行、可测试的 MoonBit 依赖求解核心库，一组覆盖版本解析、约束匹配、传递依赖和冲突诊断的测试，一个可通过 moon run cmd/main 执行的 CLI 示例，以及 README、设计文档、验收清单和本申报书。仓库将同步到 GitLink 与 GitHub，便于评审克隆和复现。</w:t>
+        <w:t>项目预期交付一个可运行的 MoonBit 依赖求解基础库，一组覆盖版本解析、约束匹配、传递依赖和冲突诊断的测试，一个可通过 moon run cmd/main 执行的 CLI 示例，以及 README、设计文档、验收清单和本申报书。仓库将同步到 GitLink 与 GitHub，便于评审克隆和复现。</w:t>
       </w:r>
     </w:p>
     <w:p>
@@ -215,12 +215,12 @@
         <w:pStyle w:val="Heading1"/>
       </w:pPr>
       <w:r>
-        <w:t>七、后续扩展方向</w:t>
+        <w:t>七、后续计划</w:t>
       </w:r>
     </w:p>
     <w:p>
       <w:r>
-        <w:t>后续可扩展真实包索引读取、结构化锁文件读写、最小变更升级建议、依赖图输出、冲突图解释、构建计划生成和与 MoonBit 包发布流程集成。相比单一文本处理工具，依赖求解方向具备更强的基础软件属性和长期扩展空间。</w:t>
+        <w:t>后续计划接入真实包索引读取、结构化锁文件读写、最小变更升级建议、依赖图输出、冲突图解释、构建计划生成和 MoonBit 包发布流程。相比单一文本处理工具，依赖求解方向更贴近包生态和构建工具链中的基础需求。</w:t>
       </w:r>
     </w:p>
     <w:sectPr>

</xml_diff>

<commit_message>
feat: harden MoonDepSolve for acceptance
</commit_message>
<xml_diff>
--- a/docs/competition/MoonDepSolve项目申报书.docx
+++ b/docs/competition/MoonDepSolve项目申报书.docx
@@ -164,7 +164,7 @@
     </w:p>
     <w:p>
       <w:r>
-        <w:t>MoonDepSolve 面向 MoonBit 包生态中的版本约束和依赖选择问题，提供语义版本解析、版本范围匹配、依赖图求解、冲突诊断和依赖锁定结果输出。项目使用 MoonBit 编写，不依赖外部服务，适合在包管理、构建规划、依赖检查和自动化发布流程中作为基础组件使用。</w:t>
+        <w:t>MoonDepSolve 面向 MoonBit 包生态中的版本约束和依赖选择问题，提供语义版本解析、版本范围匹配、依赖图求解、冲突诊断、依赖锁定结果输出、轻量文本包索引读入和 lock 读回能力。项目使用 MoonBit 编写，不依赖外部服务，适合在包管理、构建规划、依赖检查和自动化发布流程中作为基础组件使用。</w:t>
       </w:r>
     </w:p>
     <w:p>
@@ -190,7 +190,7 @@
     </w:p>
     <w:p>
       <w:r>
-        <w:t>项目目前实现语义版本解析、prerelease 排序、exact/caret/tilde/comparator/wildcard 五类约束解析、版本匹配、传递依赖求解、最高兼容版本选择、冲突路径诊断和依赖锁定结果输出。命令行示例会展示一个内置包索引的求解过程，测试覆盖成功解析和失败诊断场景。</w:t>
+        <w:t>项目目前实现语义版本解析、prerelease 排序、exact/caret/tilde/comparator/wildcard 五类约束解析、版本匹配、传递依赖求解、最高兼容版本选择、冲突路径诊断、依赖锁定结果输出、文本包索引读入和 lock 读回。命令行示例会展示一个内置包索引的求解过程，测试覆盖成功解析和失败诊断场景。</w:t>
       </w:r>
     </w:p>
     <w:p>
@@ -229,7 +229,7 @@
     </w:p>
     <w:p>
       <w:r>
-        <w:t>项目预期交付一个可运行的 MoonBit 依赖求解基础库，一组覆盖版本解析、约束匹配、传递依赖和冲突诊断的测试，一个可通过 moon run cmd/main 执行的 CLI 示例，以及 README、设计文档、验收清单和本申报书。仓库将同步到 GitLink 与 GitHub，便于评审克隆和复现。</w:t>
+        <w:t>项目预期交付一个可运行的 MoonBit 依赖求解基础库，一组覆盖版本解析、约束匹配、传递依赖、冲突诊断、文本索引读入和 lock 读回的测试，一个可通过 moon run cmd/main 执行的 CLI 示例，以及 README、设计文档、验收清单、发布清单和本申报书。仓库将同步到 GitLink 与 GitHub，便于评审克隆和复现。</w:t>
       </w:r>
     </w:p>
     <w:p>
@@ -242,7 +242,20 @@
     </w:p>
     <w:p>
       <w:r>
-        <w:t>后续计划接入真实包索引读取、结构化锁文件读写、最小变更升级建议、依赖图输出、冲突图解释、构建计划生成和 MoonBit 包发布流程。相比单一文本处理工具，依赖求解方向更贴近包生态和构建工具链中的基础需求。</w:t>
+        <w:t>后续计划接入更完整的真实包索引读取、结构化锁文件读写、最小变更升级建议、依赖图输出、冲突图解释、构建计划生成和 MoonBit 包发布流程。相比单一文本处理工具，依赖求解方向更贴近包生态和构建工具链中的基础需求。</w:t>
+      </w:r>
+    </w:p>
+    <w:p>
+      <w:pPr>
+        <w:pStyle w:val="Heading1"/>
+      </w:pPr>
+      <w:r>
+        <w:t>八、开源维护与合规</w:t>
+      </w:r>
+    </w:p>
+    <w:p>
+      <w:r>
+        <w:t>项目采用 Apache-2.0 许可证，GitLink 仓库作为比赛验收主仓库，GitHub 仓库作为同步镜像。后续维护会保持清晰提交记录、README、CI、测试、接口摘要和 Mooncakes 发布说明。若参考其他生态中的 semver 或 resolver 项目，会在文档中说明参考来源、链接、许可证和实际参考范围，不提交未经授权的私有代码、闭源代码、商业代码或来源不明的生成内容。</w:t>
       </w:r>
     </w:p>
     <w:sectPr>

</xml_diff>

<commit_message>
docs: prepare MoonDepSolve v0.2 acceptance release
</commit_message>
<xml_diff>
--- a/docs/competition/MoonDepSolve项目申报书.docx
+++ b/docs/competition/MoonDepSolve项目申报书.docx
@@ -4,84 +4,123 @@
   <w:body>
     <w:p>
       <w:pPr>
-        <w:pStyle w:val="Title"/>
+        <w:spacing w:after="20"/>
         <w:jc w:val="center"/>
       </w:pPr>
       <w:r>
-        <w:t>MoonDepSolve 项目申报书</w:t>
+        <w:rPr>
+          <w:rFonts w:ascii="Microsoft YaHei" w:hAnsi="Microsoft YaHei" w:eastAsia="Microsoft YaHei"/>
+          <w:b/>
+          <w:color w:val="17365D"/>
+          <w:sz w:val="44"/>
+        </w:rPr>
+        <w:t>MoonDepSolve v0.2 项目申报书</w:t>
+      </w:r>
+    </w:p>
+    <w:p>
+      <w:pPr>
+        <w:spacing w:after="100"/>
+        <w:jc w:val="center"/>
+      </w:pPr>
+      <w:r>
+        <w:rPr>
+          <w:rFonts w:ascii="Microsoft YaHei" w:hAnsi="Microsoft YaHei" w:eastAsia="Microsoft YaHei"/>
+          <w:b w:val="0"/>
+          <w:color w:val="4B5563"/>
+          <w:sz w:val="22"/>
+        </w:rPr>
+        <w:t>MoonBit 包生态语义版本与依赖求解基础库</w:t>
       </w:r>
     </w:p>
     <w:tbl>
       <w:tblPr>
         <w:tblStyle w:val="TableGrid"/>
         <w:tblW w:type="auto" w:w="0"/>
+        <w:jc w:val="center"/>
+        <w:tblLayout w:type="fixed"/>
         <w:tblLook w:firstColumn="1" w:firstRow="1" w:lastColumn="0" w:lastRow="0" w:noHBand="0" w:noVBand="1" w:val="04A0"/>
       </w:tblPr>
       <w:tblGrid>
-        <w:gridCol w:w="4320"/>
-        <w:gridCol w:w="4320"/>
+        <w:gridCol w:w="2622"/>
+        <w:gridCol w:w="2622"/>
+        <w:gridCol w:w="2622"/>
+        <w:gridCol w:w="2622"/>
       </w:tblGrid>
       <w:tr>
         <w:tc>
           <w:tcPr>
-            <w:tcW w:type="dxa" w:w="4320"/>
+            <w:tcW w:type="dxa" w:w="1224"/>
+            <w:vAlign w:val="center"/>
+            <w:shd w:fill="E8EEF5"/>
           </w:tcPr>
           <w:p>
+            <w:pPr>
+              <w:spacing w:after="0"/>
+            </w:pPr>
             <w:r>
-              <w:t>项目名称</w:t>
+              <w:rPr>
+                <w:rFonts w:ascii="Microsoft YaHei" w:hAnsi="Microsoft YaHei" w:eastAsia="Microsoft YaHei"/>
+                <w:b/>
+                <w:sz w:val="17"/>
+              </w:rPr>
+              <w:t>作者</w:t>
             </w:r>
           </w:p>
         </w:tc>
         <w:tc>
           <w:tcPr>
-            <w:tcW w:type="dxa" w:w="4320"/>
+            <w:tcW w:type="dxa" w:w="4824"/>
+            <w:vAlign w:val="center"/>
           </w:tcPr>
           <w:p>
+            <w:pPr>
+              <w:spacing w:after="0"/>
+            </w:pPr>
             <w:r>
-              <w:t>MoonDepSolve：MoonBit 包生态语义版本与依赖求解工具</w:t>
-            </w:r>
-          </w:p>
-        </w:tc>
-      </w:tr>
-      <w:tr>
-        <w:tc>
-          <w:tcPr>
-            <w:tcW w:type="dxa" w:w="4320"/>
-          </w:tcPr>
-          <w:p>
-            <w:r>
-              <w:t>参赛方向</w:t>
+              <w:rPr>
+                <w:rFonts w:ascii="Microsoft YaHei" w:hAnsi="Microsoft YaHei" w:eastAsia="Microsoft YaHei"/>
+                <w:b w:val="0"/>
+                <w:sz w:val="17"/>
+              </w:rPr>
+              <w:t>python123</w:t>
             </w:r>
           </w:p>
         </w:tc>
         <w:tc>
           <w:tcPr>
-            <w:tcW w:type="dxa" w:w="4320"/>
+            <w:tcW w:type="dxa" w:w="1224"/>
+            <w:vAlign w:val="center"/>
+            <w:shd w:fill="E8EEF5"/>
           </w:tcPr>
           <w:p>
+            <w:pPr>
+              <w:spacing w:after="0"/>
+            </w:pPr>
             <w:r>
-              <w:t>MoonBit 国产基础软件开源生态项目</w:t>
-            </w:r>
-          </w:p>
-        </w:tc>
-      </w:tr>
-      <w:tr>
-        <w:tc>
-          <w:tcPr>
-            <w:tcW w:type="dxa" w:w="4320"/>
-          </w:tcPr>
-          <w:p>
-            <w:r>
-              <w:t>开源许可证</w:t>
+              <w:rPr>
+                <w:rFonts w:ascii="Microsoft YaHei" w:hAnsi="Microsoft YaHei" w:eastAsia="Microsoft YaHei"/>
+                <w:b/>
+                <w:sz w:val="17"/>
+              </w:rPr>
+              <w:t>许可证</w:t>
             </w:r>
           </w:p>
         </w:tc>
         <w:tc>
           <w:tcPr>
-            <w:tcW w:type="dxa" w:w="4320"/>
+            <w:tcW w:type="dxa" w:w="5760"/>
+            <w:vAlign w:val="center"/>
           </w:tcPr>
           <w:p>
+            <w:pPr>
+              <w:spacing w:after="0"/>
+            </w:pPr>
             <w:r>
+              <w:rPr>
+                <w:rFonts w:ascii="Microsoft YaHei" w:hAnsi="Microsoft YaHei" w:eastAsia="Microsoft YaHei"/>
+                <w:b w:val="0"/>
+                <w:sz w:val="17"/>
+              </w:rPr>
               <w:t>Apache-2.0</w:t>
             </w:r>
           </w:p>
@@ -90,64 +129,78 @@
       <w:tr>
         <w:tc>
           <w:tcPr>
-            <w:tcW w:type="dxa" w:w="4320"/>
+            <w:tcW w:type="dxa" w:w="1224"/>
+            <w:vAlign w:val="center"/>
+            <w:shd w:fill="E8EEF5"/>
           </w:tcPr>
           <w:p>
+            <w:pPr>
+              <w:spacing w:after="0"/>
+            </w:pPr>
             <w:r>
-              <w:t>核心作者</w:t>
+              <w:rPr>
+                <w:rFonts w:ascii="Microsoft YaHei" w:hAnsi="Microsoft YaHei" w:eastAsia="Microsoft YaHei"/>
+                <w:b/>
+                <w:sz w:val="17"/>
+              </w:rPr>
+              <w:t>GitLink</w:t>
             </w:r>
           </w:p>
         </w:tc>
         <w:tc>
           <w:tcPr>
-            <w:tcW w:type="dxa" w:w="4320"/>
+            <w:tcW w:type="dxa" w:w="4824"/>
+            <w:vAlign w:val="center"/>
           </w:tcPr>
           <w:p>
+            <w:pPr>
+              <w:spacing w:after="0"/>
+            </w:pPr>
             <w:r>
-              <w:t>python123</w:t>
-            </w:r>
-          </w:p>
-        </w:tc>
-      </w:tr>
-      <w:tr>
-        <w:tc>
-          <w:tcPr>
-            <w:tcW w:type="dxa" w:w="4320"/>
-          </w:tcPr>
-          <w:p>
-            <w:r>
-              <w:t>GitLink 仓库</w:t>
+              <w:rPr>
+                <w:rFonts w:ascii="Microsoft YaHei" w:hAnsi="Microsoft YaHei" w:eastAsia="Microsoft YaHei"/>
+                <w:b w:val="0"/>
+                <w:sz w:val="17"/>
+              </w:rPr>
+              <w:t>https://gitlink.org.cn/python123/moondepsolve</w:t>
             </w:r>
           </w:p>
         </w:tc>
         <w:tc>
           <w:tcPr>
-            <w:tcW w:type="dxa" w:w="4320"/>
+            <w:tcW w:type="dxa" w:w="1224"/>
+            <w:vAlign w:val="center"/>
+            <w:shd w:fill="E8EEF5"/>
           </w:tcPr>
           <w:p>
+            <w:pPr>
+              <w:spacing w:after="0"/>
+            </w:pPr>
             <w:r>
-              <w:t>https://gitlink.org.cn/python123/moondepsolve</w:t>
-            </w:r>
-          </w:p>
-        </w:tc>
-      </w:tr>
-      <w:tr>
-        <w:tc>
-          <w:tcPr>
-            <w:tcW w:type="dxa" w:w="4320"/>
-          </w:tcPr>
-          <w:p>
-            <w:r>
-              <w:t>GitHub 仓库</w:t>
+              <w:rPr>
+                <w:rFonts w:ascii="Microsoft YaHei" w:hAnsi="Microsoft YaHei" w:eastAsia="Microsoft YaHei"/>
+                <w:b/>
+                <w:sz w:val="17"/>
+              </w:rPr>
+              <w:t>GitHub</w:t>
             </w:r>
           </w:p>
         </w:tc>
         <w:tc>
           <w:tcPr>
-            <w:tcW w:type="dxa" w:w="4320"/>
+            <w:tcW w:type="dxa" w:w="5760"/>
+            <w:vAlign w:val="center"/>
           </w:tcPr>
           <w:p>
+            <w:pPr>
+              <w:spacing w:after="0"/>
+            </w:pPr>
             <w:r>
+              <w:rPr>
+                <w:rFonts w:ascii="Microsoft YaHei" w:hAnsi="Microsoft YaHei" w:eastAsia="Microsoft YaHei"/>
+                <w:b w:val="0"/>
+                <w:sz w:val="17"/>
+              </w:rPr>
               <w:t>https://github.com/python123-ops/moondepsolve</w:t>
             </w:r>
           </w:p>
@@ -156,116 +209,173 @@
     </w:tbl>
     <w:p>
       <w:pPr>
-        <w:pStyle w:val="Heading1"/>
+        <w:spacing w:before="140" w:after="40"/>
       </w:pPr>
       <w:r>
-        <w:t>一、项目简介</w:t>
-      </w:r>
-    </w:p>
-    <w:p>
-      <w:r>
-        <w:t>MoonDepSolve 面向 MoonBit 包生态中的版本约束和依赖选择问题，提供语义版本解析、版本范围匹配、依赖图求解、冲突诊断、依赖锁定结果输出、轻量文本包索引读入和 lock 读回能力。项目使用 MoonBit 编写，不依赖外部服务，适合在包管理、构建规划、依赖检查和自动化发布流程中作为基础组件使用。</w:t>
+        <w:rPr>
+          <w:rFonts w:ascii="Microsoft YaHei" w:hAnsi="Microsoft YaHei" w:eastAsia="Microsoft YaHei"/>
+          <w:b/>
+          <w:color w:val="1F4D78"/>
+          <w:sz w:val="26"/>
+        </w:rPr>
+        <w:t>项目定位</w:t>
       </w:r>
     </w:p>
     <w:p>
       <w:pPr>
-        <w:pStyle w:val="Heading1"/>
+        <w:spacing w:after="40" w:line="276" w:lineRule="auto"/>
+        <w:ind w:firstLine="408"/>
       </w:pPr>
       <w:r>
-        <w:t>二、项目方向与适用场景</w:t>
-      </w:r>
-    </w:p>
-    <w:p>
-      <w:r>
-        <w:t>依赖求解是包管理和构建系统中的基础能力。随着 MoonBit 包数量增加，工具链需要能够判断版本兼容性、选择可用版本组合、解释依赖冲突，并形成稳定的解析结果。MoonDepSolve 可服务于依赖安装、构建规划、兼容性检查、依赖升级建议和教学示例等场景。</w:t>
+        <w:rPr>
+          <w:rFonts w:ascii="Microsoft YaHei" w:hAnsi="Microsoft YaHei" w:eastAsia="Microsoft YaHei"/>
+          <w:b w:val="0"/>
+          <w:sz w:val="20"/>
+        </w:rPr>
+        <w:t>MoonDepSolve 面向 MoonBit 包生态，解决版本约束解析、兼容版本选择、传递依赖展开与冲突解释问题，可复用于包管理器、构建工具、依赖审计、自动化发布和教学示例。</w:t>
       </w:r>
     </w:p>
     <w:p>
       <w:pPr>
-        <w:pStyle w:val="Heading1"/>
+        <w:spacing w:before="140" w:after="40"/>
       </w:pPr>
       <w:r>
-        <w:t>三、计划实现的核心功能</w:t>
-      </w:r>
-    </w:p>
-    <w:p>
-      <w:r>
-        <w:t>项目目前实现语义版本解析、prerelease 排序、exact/caret/tilde/comparator/wildcard 五类约束解析、版本匹配、传递依赖求解、最高兼容版本选择、冲突路径诊断、依赖锁定结果输出、文本包索引读入和 lock 读回。命令行示例会展示一个内置包索引的求解过程，测试覆盖成功解析和失败诊断场景。</w:t>
+        <w:rPr>
+          <w:rFonts w:ascii="Microsoft YaHei" w:hAnsi="Microsoft YaHei" w:eastAsia="Microsoft YaHei"/>
+          <w:b/>
+          <w:color w:val="1F4D78"/>
+          <w:sz w:val="26"/>
+        </w:rPr>
+        <w:t>v0.2 核心成果</w:t>
       </w:r>
     </w:p>
     <w:p>
       <w:pPr>
-        <w:pStyle w:val="Heading1"/>
+        <w:spacing w:after="40" w:line="276" w:lineRule="auto"/>
+        <w:ind w:firstLine="408"/>
       </w:pPr>
       <w:r>
-        <w:t>四、实现说明</w:t>
-      </w:r>
-    </w:p>
-    <w:p>
-      <w:r>
-        <w:t>项目代码围绕 MoonBit 版本约束场景自行设计数据结构、解析器、求解流程和错误诊断。目前版本控制在较小规模内，不引入外部依赖，也不绑定具体平台接口，便于评审直接克隆、运行和检查。</w:t>
+        <w:rPr>
+          <w:rFonts w:ascii="Microsoft YaHei" w:hAnsi="Microsoft YaHei" w:eastAsia="Microsoft YaHei"/>
+          <w:b w:val="0"/>
+          <w:sz w:val="20"/>
+        </w:rPr>
+        <w:t>保持 v0.1 API 兼容；支持 exact、caret、tilde、comparator set、wildcard 与最高兼容求解；支持文本 registry 和 lock 读回；新增稳定 DependencyGraph 文本/DOT 输出、Unresolved 节点，以及覆盖缺包、无匹配版本、已选版本冲突的 ConflictReport。CLI 可同时展示 lock、依赖图和候选版本降序冲突报告。</w:t>
       </w:r>
     </w:p>
     <w:p>
       <w:pPr>
-        <w:pStyle w:val="Heading1"/>
+        <w:spacing w:before="140" w:after="40"/>
       </w:pPr>
       <w:r>
-        <w:t>五、技术路线</w:t>
-      </w:r>
-    </w:p>
-    <w:p>
-      <w:r>
-        <w:t>项目采用“解析层、约束层、求解层、展示层”的结构。解析层负责版本和约束字符串；约束层将范围统一表示为 comparator 数组；求解层从根依赖开始遍历包索引，选择最高兼容版本并展开传递依赖；诊断层在包缺失、无匹配版本或已选版本冲突时输出可读错误；展示层通过 CLI 和依赖锁定结果文本展示结果。</w:t>
+        <w:rPr>
+          <w:rFonts w:ascii="Microsoft YaHei" w:hAnsi="Microsoft YaHei" w:eastAsia="Microsoft YaHei"/>
+          <w:b/>
+          <w:color w:val="1F4D78"/>
+          <w:sz w:val="26"/>
+        </w:rPr>
+        <w:t>技术路线与生态价值</w:t>
       </w:r>
     </w:p>
     <w:p>
       <w:pPr>
-        <w:pStyle w:val="Heading1"/>
+        <w:spacing w:after="40" w:line="276" w:lineRule="auto"/>
+        <w:ind w:firstLine="408"/>
       </w:pPr>
       <w:r>
-        <w:t>六、预期成果</w:t>
-      </w:r>
-    </w:p>
-    <w:p>
-      <w:r>
-        <w:t>项目预期交付一个可运行的 MoonBit 依赖求解基础库，一组覆盖版本解析、约束匹配、传递依赖、冲突诊断、文本索引读入和 lock 读回的测试，一个可通过 moon run cmd/main 执行的 CLI 示例，以及 README、设计文档、验收清单、发布清单和本申报书。仓库将同步到 GitLink 与 GitHub，便于评审克隆和复现。</w:t>
+        <w:rPr>
+          <w:rFonts w:ascii="Microsoft YaHei" w:hAnsi="Microsoft YaHei" w:eastAsia="Microsoft YaHei"/>
+          <w:b w:val="0"/>
+          <w:sz w:val="20"/>
+        </w:rPr>
+        <w:t>采用“语义版本解析—约束归一化—候选排序—递归求解—图/诊断输出”边界，全部使用 MoonBit 实现，不依赖外部服务。公共接口由 moon info 生成的 .mbti 审核，为 MoonBit 工具链补充可复用、可解释、可测试的依赖求解能力。</w:t>
       </w:r>
     </w:p>
     <w:p>
       <w:pPr>
-        <w:pStyle w:val="Heading1"/>
+        <w:spacing w:before="140" w:after="40"/>
       </w:pPr>
       <w:r>
-        <w:t>七、后续计划</w:t>
-      </w:r>
-    </w:p>
-    <w:p>
-      <w:r>
-        <w:t>后续计划接入更完整的真实包索引读取、结构化锁文件读写、最小变更升级建议、依赖图输出、冲突图解释、构建计划生成和 MoonBit 包发布流程。相比单一文本处理工具，依赖求解方向更贴近包生态和构建工具链中的基础需求。</w:t>
+        <w:rPr>
+          <w:rFonts w:ascii="Microsoft YaHei" w:hAnsi="Microsoft YaHei" w:eastAsia="Microsoft YaHei"/>
+          <w:b/>
+          <w:color w:val="1F4D78"/>
+          <w:sz w:val="26"/>
+        </w:rPr>
+        <w:t>工程质量与公开维护</w:t>
       </w:r>
     </w:p>
     <w:p>
       <w:pPr>
-        <w:pStyle w:val="Heading1"/>
+        <w:spacing w:after="40" w:line="276" w:lineRule="auto"/>
+        <w:ind w:firstLine="408"/>
       </w:pPr>
       <w:r>
-        <w:t>八、开源维护与合规</w:t>
+        <w:rPr>
+          <w:rFonts w:ascii="Microsoft YaHei" w:hAnsi="Microsoft YaHei" w:eastAsia="Microsoft YaHei"/>
+          <w:b w:val="0"/>
+          <w:sz w:val="20"/>
+        </w:rPr>
+        <w:t>19 项测试覆盖版本边界、错误索引/lock、求解冲突、图稳定性和 DOT 转义，核心 moondepsolve.mbt 无未覆盖行。CI 拉取完整历史，先检查 author/committer 仅为 python123，再执行接口、格式、覆盖率测试与 CLI。仓库提供 Apache-2.0、README、Changelog、贡献/安全规范和 Issue/PR 模板。</w:t>
       </w:r>
     </w:p>
     <w:p>
+      <w:pPr>
+        <w:spacing w:before="140" w:after="40"/>
+      </w:pPr>
       <w:r>
-        <w:t>项目采用 Apache-2.0 许可证，GitLink 仓库作为比赛验收主仓库，GitHub 仓库作为同步镜像。后续维护会保持清晰提交记录、README、CI、测试、接口摘要和 Mooncakes 发布说明。若参考其他生态中的 semver 或 resolver 项目，会在文档中说明参考来源、链接、许可证和实际参考范围，不提交未经授权的私有代码、闭源代码、商业代码或来源不明的生成内容。</w:t>
+        <w:rPr>
+          <w:rFonts w:ascii="Microsoft YaHei" w:hAnsi="Microsoft YaHei" w:eastAsia="Microsoft YaHei"/>
+          <w:b/>
+          <w:color w:val="1F4D78"/>
+          <w:sz w:val="26"/>
+        </w:rPr>
+        <w:t>赛事进度与后续计划</w:t>
+      </w:r>
+    </w:p>
+    <w:p>
+      <w:pPr>
+        <w:spacing w:after="40" w:line="276" w:lineRule="auto"/>
+        <w:ind w:firstLine="408"/>
+      </w:pPr>
+      <w:r>
+        <w:rPr>
+          <w:rFonts w:ascii="Microsoft YaHei" w:hAnsi="Microsoft YaHei" w:eastAsia="Microsoft YaHei"/>
+          <w:b w:val="0"/>
+          <w:sz w:val="20"/>
+        </w:rPr>
+        <w:t>官方开发期为 2026-04-29 至 2026-07-12，验收期为 7 月 13-17 日。4 月 29 日后新增求解/索引/lock、v0.2 图和冲突报告、边界测试、身份门禁、CI 与材料。验收前完成 Mooncakes dry-run 和双远端 fresh clone；v0.3 推进最高兼容升级建议与最小变更升级计划。</w:t>
       </w:r>
     </w:p>
     <w:sectPr>
-      <w:pgSz w:w="12240" w:h="15840"/>
-      <w:pgMar w:top="1440" w:right="1800" w:bottom="1440" w:left="1800" w:header="720" w:footer="720" w:gutter="0"/>
+      <w:footerReference w:type="default" r:id="rId9"/>
+      <w:pgSz w:w="11906" w:h="16838"/>
+      <w:pgMar w:top="595" w:right="709" w:bottom="595" w:left="709" w:header="227" w:footer="227" w:gutter="0"/>
       <w:cols w:space="720"/>
       <w:docGrid w:linePitch="360"/>
     </w:sectPr>
   </w:body>
 </w:document>
+</file>
+
+<file path=word/footer1.xml><?xml version="1.0" encoding="utf-8"?>
+<w:ftr xmlns:m="http://schemas.openxmlformats.org/officeDocument/2006/math" xmlns:mc="http://schemas.openxmlformats.org/markup-compatibility/2006" xmlns:mo="http://schemas.microsoft.com/office/mac/office/2008/main" xmlns:mv="urn:schemas-microsoft-com:mac:vml" xmlns:o="urn:schemas-microsoft-com:office:office" xmlns:r="http://schemas.openxmlformats.org/officeDocument/2006/relationships" xmlns:v="urn:schemas-microsoft-com:vml" xmlns:w10="urn:schemas-microsoft-com:office:word" xmlns:w14="http://schemas.microsoft.com/office/word/2010/wordml" xmlns:w="http://schemas.openxmlformats.org/wordprocessingml/2006/main" xmlns:wne="http://schemas.microsoft.com/office/word/2006/wordml" xmlns:wp14="http://schemas.microsoft.com/office/word/2010/wordprocessingDrawing" xmlns:wp="http://schemas.openxmlformats.org/drawingml/2006/wordprocessingDrawing" xmlns:wpc="http://schemas.microsoft.com/office/word/2010/wordprocessingCanvas" xmlns:wpg="http://schemas.microsoft.com/office/word/2010/wordprocessingGroup" xmlns:wpi="http://schemas.microsoft.com/office/word/2010/wordprocessingInk" xmlns:wps="http://schemas.microsoft.com/office/word/2010/wordprocessingShape" mc:Ignorable="w14 wp14">
+  <w:p>
+    <w:pPr>
+      <w:pStyle w:val="Footer"/>
+      <w:jc w:val="right"/>
+    </w:pPr>
+    <w:r>
+      <w:rPr>
+        <w:rFonts w:ascii="Microsoft YaHei" w:hAnsi="Microsoft YaHei" w:eastAsia="Microsoft YaHei"/>
+        <w:b w:val="0"/>
+        <w:color w:val="6B7280"/>
+        <w:sz w:val="15"/>
+      </w:rPr>
+      <w:t>MoonDepSolve v0.2 · 2026-06-18</w:t>
+    </w:r>
+  </w:p>
+</w:ftr>
 </file>
 
 <file path=word/numbering.xml><?xml version="1.0" encoding="utf-8"?>
@@ -631,9 +741,12 @@
     <w:name w:val="Normal"/>
     <w:qFormat/>
     <w:rsid w:val="00FC693F"/>
+    <w:pPr>
+      <w:spacing w:after="40" w:line="276" w:lineRule="auto"/>
+    </w:pPr>
     <w:rPr>
       <w:rFonts w:ascii="Microsoft YaHei" w:hAnsi="Microsoft YaHei"/>
-      <w:sz w:val="21"/>
+      <w:sz w:val="20"/>
     </w:rPr>
   </w:style>
   <w:style w:type="paragraph" w:styleId="Header">

</xml_diff>

<commit_message>
docs: prepare MoonDepSolve v0.3 acceptance delivery
</commit_message>
<xml_diff>
--- a/docs/competition/MoonDepSolve项目申报书.docx
+++ b/docs/competition/MoonDepSolve项目申报书.docx
@@ -12,9 +12,9 @@
           <w:rFonts w:ascii="Microsoft YaHei" w:hAnsi="Microsoft YaHei" w:eastAsia="Microsoft YaHei"/>
           <w:b/>
           <w:color w:val="17365D"/>
-          <w:sz w:val="44"/>
+          <w:sz w:val="46"/>
         </w:rPr>
-        <w:t>MoonDepSolve v0.2 项目申报书</w:t>
+        <w:t>MoonDepSolve v0.3 项目申报书</w:t>
       </w:r>
     </w:p>
     <w:p>
@@ -27,29 +27,36 @@
           <w:rFonts w:ascii="Microsoft YaHei" w:hAnsi="Microsoft YaHei" w:eastAsia="Microsoft YaHei"/>
           <w:b w:val="0"/>
           <w:color w:val="4B5563"/>
-          <w:sz w:val="22"/>
+          <w:sz w:val="23"/>
         </w:rPr>
-        <w:t>MoonBit 包生态语义版本与依赖求解基础库</w:t>
+        <w:t>MoonBit 包生态语义版本、依赖求解与升级规划基础库</w:t>
       </w:r>
     </w:p>
     <w:tbl>
       <w:tblPr>
         <w:tblStyle w:val="TableGrid"/>
-        <w:tblW w:type="auto" w:w="0"/>
+        <w:tblW w:type="dxa" w:w="10340"/>
         <w:jc w:val="center"/>
         <w:tblLayout w:type="fixed"/>
         <w:tblLook w:firstColumn="1" w:firstRow="1" w:lastColumn="0" w:lastRow="0" w:noHBand="0" w:noVBand="1" w:val="04A0"/>
+        <w:tblInd w:w="120" w:type="dxa"/>
       </w:tblPr>
       <w:tblGrid>
-        <w:gridCol w:w="2622"/>
-        <w:gridCol w:w="2622"/>
-        <w:gridCol w:w="2622"/>
-        <w:gridCol w:w="2622"/>
+        <w:gridCol w:w="950"/>
+        <w:gridCol w:w="3750"/>
+        <w:gridCol w:w="950"/>
+        <w:gridCol w:w="4690"/>
       </w:tblGrid>
       <w:tr>
         <w:tc>
           <w:tcPr>
-            <w:tcW w:type="dxa" w:w="1224"/>
+            <w:tcW w:type="dxa" w:w="950"/>
+            <w:tcMar>
+              <w:top w:w="80" w:type="dxa"/>
+              <w:bottom w:w="80" w:type="dxa"/>
+              <w:start w:w="120" w:type="dxa"/>
+              <w:end w:w="120" w:type="dxa"/>
+            </w:tcMar>
             <w:vAlign w:val="center"/>
             <w:shd w:fill="E8EEF5"/>
           </w:tcPr>
@@ -69,7 +76,13 @@
         </w:tc>
         <w:tc>
           <w:tcPr>
-            <w:tcW w:type="dxa" w:w="4824"/>
+            <w:tcW w:type="dxa" w:w="3750"/>
+            <w:tcMar>
+              <w:top w:w="80" w:type="dxa"/>
+              <w:bottom w:w="80" w:type="dxa"/>
+              <w:start w:w="120" w:type="dxa"/>
+              <w:end w:w="120" w:type="dxa"/>
+            </w:tcMar>
             <w:vAlign w:val="center"/>
           </w:tcPr>
           <w:p>
@@ -88,7 +101,13 @@
         </w:tc>
         <w:tc>
           <w:tcPr>
-            <w:tcW w:type="dxa" w:w="1224"/>
+            <w:tcW w:type="dxa" w:w="950"/>
+            <w:tcMar>
+              <w:top w:w="80" w:type="dxa"/>
+              <w:bottom w:w="80" w:type="dxa"/>
+              <w:start w:w="120" w:type="dxa"/>
+              <w:end w:w="120" w:type="dxa"/>
+            </w:tcMar>
             <w:vAlign w:val="center"/>
             <w:shd w:fill="E8EEF5"/>
           </w:tcPr>
@@ -108,7 +127,13 @@
         </w:tc>
         <w:tc>
           <w:tcPr>
-            <w:tcW w:type="dxa" w:w="5760"/>
+            <w:tcW w:type="dxa" w:w="4690"/>
+            <w:tcMar>
+              <w:top w:w="80" w:type="dxa"/>
+              <w:bottom w:w="80" w:type="dxa"/>
+              <w:start w:w="120" w:type="dxa"/>
+              <w:end w:w="120" w:type="dxa"/>
+            </w:tcMar>
             <w:vAlign w:val="center"/>
           </w:tcPr>
           <w:p>
@@ -129,7 +154,13 @@
       <w:tr>
         <w:tc>
           <w:tcPr>
-            <w:tcW w:type="dxa" w:w="1224"/>
+            <w:tcW w:type="dxa" w:w="950"/>
+            <w:tcMar>
+              <w:top w:w="80" w:type="dxa"/>
+              <w:bottom w:w="80" w:type="dxa"/>
+              <w:start w:w="120" w:type="dxa"/>
+              <w:end w:w="120" w:type="dxa"/>
+            </w:tcMar>
             <w:vAlign w:val="center"/>
             <w:shd w:fill="E8EEF5"/>
           </w:tcPr>
@@ -149,7 +180,13 @@
         </w:tc>
         <w:tc>
           <w:tcPr>
-            <w:tcW w:type="dxa" w:w="4824"/>
+            <w:tcW w:type="dxa" w:w="3750"/>
+            <w:tcMar>
+              <w:top w:w="80" w:type="dxa"/>
+              <w:bottom w:w="80" w:type="dxa"/>
+              <w:start w:w="120" w:type="dxa"/>
+              <w:end w:w="120" w:type="dxa"/>
+            </w:tcMar>
             <w:vAlign w:val="center"/>
           </w:tcPr>
           <w:p>
@@ -162,13 +199,19 @@
                 <w:b w:val="0"/>
                 <w:sz w:val="17"/>
               </w:rPr>
-              <w:t>https://gitlink.org.cn/python123/moondepsolve</w:t>
+              <w:t>gitlink.org.cn/python123/moondepsolve</w:t>
             </w:r>
           </w:p>
         </w:tc>
         <w:tc>
           <w:tcPr>
-            <w:tcW w:type="dxa" w:w="1224"/>
+            <w:tcW w:type="dxa" w:w="950"/>
+            <w:tcMar>
+              <w:top w:w="80" w:type="dxa"/>
+              <w:bottom w:w="80" w:type="dxa"/>
+              <w:start w:w="120" w:type="dxa"/>
+              <w:end w:w="120" w:type="dxa"/>
+            </w:tcMar>
             <w:vAlign w:val="center"/>
             <w:shd w:fill="E8EEF5"/>
           </w:tcPr>
@@ -188,7 +231,13 @@
         </w:tc>
         <w:tc>
           <w:tcPr>
-            <w:tcW w:type="dxa" w:w="5760"/>
+            <w:tcW w:type="dxa" w:w="4690"/>
+            <w:tcMar>
+              <w:top w:w="80" w:type="dxa"/>
+              <w:bottom w:w="80" w:type="dxa"/>
+              <w:start w:w="120" w:type="dxa"/>
+              <w:end w:w="120" w:type="dxa"/>
+            </w:tcMar>
             <w:vAlign w:val="center"/>
           </w:tcPr>
           <w:p>
@@ -201,7 +250,7 @@
                 <w:b w:val="0"/>
                 <w:sz w:val="17"/>
               </w:rPr>
-              <w:t>https://github.com/python123-ops/moondepsolve</w:t>
+              <w:t>github.com/python123-ops/moondepsolve</w:t>
             </w:r>
           </w:p>
         </w:tc>
@@ -209,21 +258,15 @@
     </w:tbl>
     <w:p>
       <w:pPr>
-        <w:spacing w:before="140" w:after="40"/>
+        <w:pStyle w:val="Heading1"/>
       </w:pPr>
       <w:r>
-        <w:rPr>
-          <w:rFonts w:ascii="Microsoft YaHei" w:hAnsi="Microsoft YaHei" w:eastAsia="Microsoft YaHei"/>
-          <w:b/>
-          <w:color w:val="1F4D78"/>
-          <w:sz w:val="26"/>
-        </w:rPr>
         <w:t>项目定位</w:t>
       </w:r>
     </w:p>
     <w:p>
       <w:pPr>
-        <w:spacing w:after="40" w:line="276" w:lineRule="auto"/>
+        <w:spacing w:after="60" w:line="276" w:lineRule="auto"/>
         <w:ind w:firstLine="408"/>
       </w:pPr>
       <w:r>
@@ -232,26 +275,20 @@
           <w:b w:val="0"/>
           <w:sz w:val="20"/>
         </w:rPr>
-        <w:t>MoonDepSolve 面向 MoonBit 包生态，解决版本约束解析、兼容版本选择、传递依赖展开与冲突解释问题，可复用于包管理器、构建工具、依赖审计、自动化发布和教学示例。</w:t>
+        <w:t>MoonDepSolve 面向 MoonBit 包生态，覆盖版本约束、传递依赖求解、稳定 lock、依赖图、冲突解释和升级规划，可复用于包管理器、构建工具、依赖审计与自动化发布。</w:t>
       </w:r>
     </w:p>
     <w:p>
       <w:pPr>
-        <w:spacing w:before="140" w:after="40"/>
+        <w:pStyle w:val="Heading1"/>
       </w:pPr>
       <w:r>
-        <w:rPr>
-          <w:rFonts w:ascii="Microsoft YaHei" w:hAnsi="Microsoft YaHei" w:eastAsia="Microsoft YaHei"/>
-          <w:b/>
-          <w:color w:val="1F4D78"/>
-          <w:sz w:val="26"/>
-        </w:rPr>
-        <w:t>v0.2 核心成果</w:t>
+        <w:t>v0.3 核心成果</w:t>
       </w:r>
     </w:p>
     <w:p>
       <w:pPr>
-        <w:spacing w:after="40" w:line="276" w:lineRule="auto"/>
+        <w:spacing w:after="60" w:line="276" w:lineRule="auto"/>
         <w:ind w:firstLine="408"/>
       </w:pPr>
       <w:r>
@@ -260,26 +297,20 @@
           <w:b w:val="0"/>
           <w:sz w:val="20"/>
         </w:rPr>
-        <w:t>保持 v0.1 API 兼容；支持 exact、caret、tilde、comparator set、wildcard 与最高兼容求解；支持文本 registry 和 lock 读回；新增稳定 DependencyGraph 文本/DOT 输出、Unresolved 节点，以及覆盖缺包、无匹配版本、已选版本冲突的 ConflictReport。CLI 可同时展示 lock、依赖图和候选版本降序冲突报告。</w:t>
+        <w:t>保持 v0.1/v0.2 API 兼容；新增 HighestCompatible 与精确 MinimalChange，先最小化变更包数量，同成本时稳定偏好更高版本；新增 UpgradePlan 及有界搜索错误。原生文件 CLI 可从 registry/lock 执行 resolve 和 plan，输出 lock、文本图或 Graphviz DOT。</w:t>
       </w:r>
     </w:p>
     <w:p>
       <w:pPr>
-        <w:spacing w:before="140" w:after="40"/>
+        <w:pStyle w:val="Heading1"/>
       </w:pPr>
       <w:r>
-        <w:rPr>
-          <w:rFonts w:ascii="Microsoft YaHei" w:hAnsi="Microsoft YaHei" w:eastAsia="Microsoft YaHei"/>
-          <w:b/>
-          <w:color w:val="1F4D78"/>
-          <w:sz w:val="26"/>
-        </w:rPr>
         <w:t>技术路线与生态价值</w:t>
       </w:r>
     </w:p>
     <w:p>
       <w:pPr>
-        <w:spacing w:after="40" w:line="276" w:lineRule="auto"/>
+        <w:spacing w:after="60" w:line="276" w:lineRule="auto"/>
         <w:ind w:firstLine="408"/>
       </w:pPr>
       <w:r>
@@ -288,26 +319,20 @@
           <w:b w:val="0"/>
           <w:sz w:val="20"/>
         </w:rPr>
-        <w:t>采用“语义版本解析—约束归一化—候选排序—递归求解—图/诊断输出”边界，全部使用 MoonBit 实现，不依赖外部服务。公共接口由 moon info 生成的 .mbti 审核，为 MoonBit 工具链补充可复用、可解释、可测试的依赖求解能力。</w:t>
+        <w:t>采用“版本解析 -&gt; 约束匹配 -&gt; 候选稳定排序 -&gt; 递归求解/有界精确搜索 -&gt; lock/图/诊断输出”边界。核心算法使用 MoonBit，公共接口由 moon info 生成的 .mbti 审核；文件工具使用官方 moonbitlang/async/fs，为 MoonBit 工具链补充可复用、可解释、可测试的依赖能力。</w:t>
       </w:r>
     </w:p>
     <w:p>
       <w:pPr>
-        <w:spacing w:before="140" w:after="40"/>
+        <w:pStyle w:val="Heading1"/>
       </w:pPr>
       <w:r>
-        <w:rPr>
-          <w:rFonts w:ascii="Microsoft YaHei" w:hAnsi="Microsoft YaHei" w:eastAsia="Microsoft YaHei"/>
-          <w:b/>
-          <w:color w:val="1F4D78"/>
-          <w:sz w:val="26"/>
-        </w:rPr>
         <w:t>工程质量与公开维护</w:t>
       </w:r>
     </w:p>
     <w:p>
       <w:pPr>
-        <w:spacing w:after="40" w:line="276" w:lineRule="auto"/>
+        <w:spacing w:after="60" w:line="276" w:lineRule="auto"/>
         <w:ind w:firstLine="408"/>
       </w:pPr>
       <w:r>
@@ -316,26 +341,20 @@
           <w:b w:val="0"/>
           <w:sz w:val="20"/>
         </w:rPr>
-        <w:t>19 项测试覆盖版本边界、错误索引/lock、求解冲突、图稳定性和 DOT 转义，核心 moondepsolve.mbt 无未覆盖行。CI 拉取完整历史，先检查 author/committer 仅为 python123，再执行接口、格式、覆盖率测试与 CLI。仓库提供 Apache-2.0、README、Changelog、贡献/安全规范和 Issue/PR 模板。</w:t>
+        <w:t>默认后端 27 项、native 后端 31 项测试通过，另有 4 组 CLI expected 输出回归。CI 拉取完整历史，先检查 author/committer 仅为 python123，再检查接口、格式、诊断、覆盖率和 native CLI。仓库提供 Apache-2.0、README、Changelog、贡献/安全规范、模板与第三方许可证记录。</w:t>
       </w:r>
     </w:p>
     <w:p>
       <w:pPr>
-        <w:spacing w:before="140" w:after="40"/>
+        <w:pStyle w:val="Heading1"/>
       </w:pPr>
       <w:r>
-        <w:rPr>
-          <w:rFonts w:ascii="Microsoft YaHei" w:hAnsi="Microsoft YaHei" w:eastAsia="Microsoft YaHei"/>
-          <w:b/>
-          <w:color w:val="1F4D78"/>
-          <w:sz w:val="26"/>
-        </w:rPr>
-        <w:t>赛事进度与后续计划</w:t>
+        <w:t>赛事进度与交付</w:t>
       </w:r>
     </w:p>
     <w:p>
       <w:pPr>
-        <w:spacing w:after="40" w:line="276" w:lineRule="auto"/>
+        <w:spacing w:after="60" w:line="276" w:lineRule="auto"/>
         <w:ind w:firstLine="408"/>
       </w:pPr>
       <w:r>
@@ -344,7 +363,7 @@
           <w:b w:val="0"/>
           <w:sz w:val="20"/>
         </w:rPr>
-        <w:t>官方开发期为 2026-04-29 至 2026-07-12，验收期为 7 月 13-17 日。4 月 29 日后新增求解/索引/lock、v0.2 图和冲突报告、边界测试、身份门禁、CI 与材料。验收前完成 Mooncakes dry-run 和双远端 fresh clone；v0.3 推进最高兼容升级建议与最小变更升级计划。</w:t>
+        <w:t>官方开发期为 2026-04-29 至 2026-07-12，验收期为 2026-07-13 至 2026-07-17。4 月 29 日后完成 v0.1 求解基础、v0.2 图与冲突解释、v0.3 精确升级规划和文件 CLI。终验交付双仓库一致历史、v0.3.0 标签/Release、fresh clone 复验与 Mooncakes dry-run；发布由 python123 授权执行。</w:t>
       </w:r>
     </w:p>
     <w:sectPr>
@@ -372,7 +391,7 @@
         <w:color w:val="6B7280"/>
         <w:sz w:val="15"/>
       </w:rPr>
-      <w:t>MoonDepSolve v0.2 · 2026-06-18</w:t>
+      <w:t>MoonDepSolve v0.3 | 2026-06-21</w:t>
     </w:r>
   </w:p>
 </w:ftr>
@@ -742,10 +761,10 @@
     <w:qFormat/>
     <w:rsid w:val="00FC693F"/>
     <w:pPr>
-      <w:spacing w:after="40" w:line="276" w:lineRule="auto"/>
+      <w:spacing w:after="60" w:line="276" w:lineRule="auto"/>
     </w:pPr>
     <w:rPr>
-      <w:rFonts w:ascii="Microsoft YaHei" w:hAnsi="Microsoft YaHei"/>
+      <w:rFonts w:ascii="Microsoft YaHei" w:hAnsi="Microsoft YaHei" w:eastAsia="Microsoft YaHei"/>
       <w:sz w:val="20"/>
     </w:rPr>
   </w:style>
@@ -804,15 +823,15 @@
     <w:pPr>
       <w:keepNext/>
       <w:keepLines/>
-      <w:spacing w:before="480" w:after="0"/>
+      <w:spacing w:before="200" w:after="80"/>
       <w:outlineLvl w:val="0"/>
     </w:pPr>
     <w:rPr>
-      <w:rFonts w:asciiTheme="majorHAnsi" w:eastAsiaTheme="majorEastAsia" w:hAnsiTheme="majorHAnsi" w:cstheme="majorBidi"/>
+      <w:rFonts w:asciiTheme="majorHAnsi" w:eastAsiaTheme="majorEastAsia" w:hAnsiTheme="majorHAnsi" w:cstheme="majorBidi" w:ascii="Microsoft YaHei" w:hAnsi="Microsoft YaHei" w:eastAsia="Microsoft YaHei"/>
       <w:b/>
       <w:bCs/>
-      <w:color w:val="365F91" w:themeColor="accent1" w:themeShade="BF"/>
-      <w:sz w:val="28"/>
+      <w:color w:val="1F4D78"/>
+      <w:sz w:val="26"/>
       <w:szCs w:val="28"/>
     </w:rPr>
   </w:style>

</xml_diff>